<commit_message>
Update BIS 15L Project Rubric W26 Group 9.docx
</commit_message>
<xml_diff>
--- a/grading/BIS 15L Project Rubric W26 Group 9.docx
+++ b/grading/BIS 15L Project Rubric W26 Group 9.docx
@@ -1281,6 +1281,36 @@
       </w:pPr>
       <w:r>
         <w:t>Your apps are great! I especially liked Countries Throughout the Years and CO2 emissions. The second app had some formatting issues that could be adjusted on the x-axis.</w:t>
+      </w:r>
+    </w:p>
+    <w:p>
+      <w:pPr>
+        <w:pStyle w:val="ListParagraph"/>
+        <w:numPr>
+          <w:ilvl w:val="0"/>
+          <w:numId w:val="1"/>
+        </w:numPr>
+      </w:pPr>
+      <w:r>
+        <w:t>Some of your .</w:t>
+      </w:r>
+      <w:proofErr w:type="spellStart"/>
+      <w:r>
+        <w:t>Rmd</w:t>
+      </w:r>
+      <w:proofErr w:type="spellEnd"/>
+      <w:r>
+        <w:t xml:space="preserve"> files had knitting issues because you left </w:t>
+      </w:r>
+      <w:proofErr w:type="spellStart"/>
+      <w:proofErr w:type="gramStart"/>
+      <w:r>
+        <w:t>install.packages</w:t>
+      </w:r>
+      <w:proofErr w:type="spellEnd"/>
+      <w:proofErr w:type="gramEnd"/>
+      <w:r>
+        <w:t xml:space="preserve"> in the code. It’s OK to have this in the code, but it needs to be commented out or not run.</w:t>
       </w:r>
     </w:p>
     <w:p>

</xml_diff>